<commit_message>
Rever tabela Art.º 9.º — análise frase a frase com divergências detalhadas
Inclui: fins lucrativos (ausente no @rgbeac), tipo de procedimento (comunicação com prazo vs. mera comunicação), prazo de produção de efeitos, poder de indeferimento, elementos informativos alínea a alínea (al. j) exclusiva do @rgbeac), via eletrónica, âmbito das alterações, instrução regional vs. central, prazo de encerramento (10 vs. 5 dias úteis), reconhecimento mútuo (ausente na @legislacao).

https://claude.ai/code/session_013gc37ZfszD9QAJQ5M1gWcB
</commit_message>
<xml_diff>
--- a/tabela_art9_notificacao_registo.docx
+++ b/tabela_art9_notificacao_registo.docx
@@ -35,7 +35,7 @@
           <w:b w:val="0"/>
           <w:sz w:val="18"/>
         </w:rPr>
-        <w:t>@rgbeac (proposta jun. 2025) × @codigo (proposta DL 214/2013) × @legislacao (vigente)</w:t>
+        <w:t>@rgbeac × @codigo × @legislacao vigente  |  Análise artigo-a-artigo</w:t>
       </w:r>
     </w:p>
     <w:p>
@@ -52,7 +52,7 @@
     </w:p>
     <w:p>
       <w:pPr>
-        <w:spacing w:after="0" w:before="0"/>
+        <w:spacing w:before="0" w:after="0"/>
       </w:pPr>
     </w:p>
     <w:p>
@@ -61,7 +61,7 @@
           <w:b/>
           <w:sz w:val="20"/>
         </w:rPr>
-        <w:t>1. Tipo de procedimento de notificação/comunicação</w:t>
+        <w:t>1. Âmbito de aplicação e critério de fins lucrativos</w:t>
       </w:r>
     </w:p>
     <w:tbl>
@@ -135,7 +135,7 @@
               </w:rPr>
               <w:t>@legislacao</w:t>
               <w:br/>
-              <w:t>(legislação vigente)</w:t>
+              <w:t>(vigente)</w:t>
             </w:r>
           </w:p>
         </w:tc>
@@ -151,7 +151,7 @@
                 <w:b/>
                 <w:sz w:val="16"/>
               </w:rPr>
-              <w:t>Regime geral</w:t>
+              <w:t>Norma de referência</w:t>
             </w:r>
           </w:p>
         </w:tc>
@@ -165,9 +165,7 @@
                 <w:b w:val="0"/>
                 <w:sz w:val="16"/>
               </w:rPr>
-              <w:t>Comunicação prévia com prazo (Art.º 60.º, n.º 1)</w:t>
-              <w:br/>
-              <w:t>Produz efeitos 30 dias após registo; DGAV pode indeferir até ao fim desse prazo (Art.º 60.º, n.ºs 5 e 6)</w:t>
+              <w:t>Art.º 60.º, n.º 1</w:t>
             </w:r>
           </w:p>
         </w:tc>
@@ -181,9 +179,7 @@
                 <w:b w:val="0"/>
                 <w:sz w:val="16"/>
               </w:rPr>
-              <w:t>Mera comunicação prévia — al. a) do Art.º 31.º</w:t>
-              <w:br/>
-              <w:t>(regra geral)</w:t>
+              <w:t>Art.º 31.º, al. a) e al. b)</w:t>
             </w:r>
           </w:p>
         </w:tc>
@@ -197,9 +193,7 @@
                 <w:b w:val="0"/>
                 <w:sz w:val="16"/>
               </w:rPr>
-              <w:t>Mera comunicação prévia — al. a) do n.º 1 do Art.º 3.º</w:t>
-              <w:br/>
-              <w:t>(regra geral)</w:t>
+              <w:t>Art.º 3.º, n.º 1, al. a) e al. b)</w:t>
             </w:r>
           </w:p>
         </w:tc>
@@ -215,7 +209,7 @@
                 <w:b/>
                 <w:sz w:val="16"/>
               </w:rPr>
-              <w:t>Regime especial (raças perigosas)</w:t>
+              <w:t>Atividades sujeitas — mera comunicação / comunicação com prazo</w:t>
             </w:r>
           </w:p>
         </w:tc>
@@ -229,7 +223,9 @@
                 <w:b w:val="0"/>
                 <w:sz w:val="16"/>
               </w:rPr>
-              <w:t>Não previsto como regime separado</w:t>
+              <w:t>Alojamentos para hospedagem, incluindo centros de bem-estar animal, exceto os destinados exclusivamente à venda.</w:t>
+              <w:br/>
+              <w:t>Não distingue fins lucrativos ou sem fins lucrativos.</w:t>
             </w:r>
           </w:p>
         </w:tc>
@@ -243,9 +239,7 @@
                 <w:b w:val="0"/>
                 <w:sz w:val="16"/>
               </w:rPr>
-              <w:t>Permissão administrativa — al. b) do Art.º 31.º</w:t>
-              <w:br/>
-              <w:t>(criação de animais potencialmente perigosos)</w:t>
+              <w:t>Centros de recolha e alojamentos para hospedagem, com ou sem fins lucrativos, exceto os destinados exclusivamente à venda.</w:t>
             </w:r>
           </w:p>
         </w:tc>
@@ -259,9 +253,7 @@
                 <w:b w:val="0"/>
                 <w:sz w:val="16"/>
               </w:rPr>
-              <w:t>Permissão administrativa — al. b) do n.º 1 do Art.º 3.º</w:t>
-              <w:br/>
-              <w:t>(criação de animais potencialmente perigosos)</w:t>
+              <w:t>Centros de recolha, alojamentos para hospedagem, com ou sem fins lucrativos, e criação comercial de animais de companhia, exceto os destinados exclusivamente à venda.</w:t>
             </w:r>
           </w:p>
         </w:tc>
@@ -277,7 +269,7 @@
                 <w:b/>
                 <w:sz w:val="16"/>
               </w:rPr>
-              <w:t>Número de identificação atribuído</w:t>
+              <w:t>Critério "fins lucrativos"</w:t>
             </w:r>
           </w:p>
         </w:tc>
@@ -291,7 +283,7 @@
                 <w:b w:val="0"/>
                 <w:sz w:val="16"/>
               </w:rPr>
-              <w:t>Art.º 60.º, n.º 2 — a comunicação prévia dá lugar a número de identificação do alojamento</w:t>
+              <w:t>❌ Abandonado — o @rgbeac não utiliza esta distinção.</w:t>
             </w:r>
           </w:p>
         </w:tc>
@@ -305,7 +297,7 @@
                 <w:b w:val="0"/>
                 <w:sz w:val="16"/>
               </w:rPr>
-              <w:t>Não previsto expressamente</w:t>
+              <w:t>✅ Presente — distingue "com ou sem fins lucrativos" na al. a) e usa "com fins lucrativos" como condição da permissão administrativa na al. b).</w:t>
             </w:r>
           </w:p>
         </w:tc>
@@ -319,7 +311,123 @@
                 <w:b w:val="0"/>
                 <w:sz w:val="16"/>
               </w:rPr>
-              <w:t>N.º 11 do Art.º 3.º — comunicação/permissão dão lugar a número de identificação pessoal e intransmissível</w:t>
+              <w:t>✅ Presente — mesma estrutura do @codigo.</w:t>
+            </w:r>
+          </w:p>
+        </w:tc>
+      </w:tr>
+      <w:tr>
+        <w:tc>
+          <w:tcPr>
+            <w:tcW w:type="dxa" w:w="2268"/>
+          </w:tcPr>
+          <w:p>
+            <w:r>
+              <w:rPr>
+                <w:b/>
+                <w:sz w:val="16"/>
+              </w:rPr>
+              <w:t>Criação comercial de animais de companhia como atividade autónoma</w:t>
+            </w:r>
+          </w:p>
+        </w:tc>
+        <w:tc>
+          <w:tcPr>
+            <w:tcW w:type="dxa" w:w="3023"/>
+          </w:tcPr>
+          <w:p>
+            <w:r>
+              <w:rPr>
+                <w:b w:val="0"/>
+                <w:sz w:val="16"/>
+              </w:rPr>
+              <w:t>❌ Não prevista expressamente como atividade autónoma.</w:t>
+            </w:r>
+          </w:p>
+        </w:tc>
+        <w:tc>
+          <w:tcPr>
+            <w:tcW w:type="dxa" w:w="3024"/>
+          </w:tcPr>
+          <w:p>
+            <w:r>
+              <w:rPr>
+                <w:b w:val="0"/>
+                <w:sz w:val="16"/>
+              </w:rPr>
+              <w:t>❌ Não prevista como atividade autónoma no Art.º 31.º.</w:t>
+            </w:r>
+          </w:p>
+        </w:tc>
+        <w:tc>
+          <w:tcPr>
+            <w:tcW w:type="dxa" w:w="3024"/>
+          </w:tcPr>
+          <w:p>
+            <w:r>
+              <w:rPr>
+                <w:b w:val="0"/>
+                <w:sz w:val="16"/>
+              </w:rPr>
+              <w:t>✅ Incluída expressamente na al. a) do n.º 1 do Art.º 3.º, a par dos alojamentos.</w:t>
+            </w:r>
+          </w:p>
+        </w:tc>
+      </w:tr>
+      <w:tr>
+        <w:tc>
+          <w:tcPr>
+            <w:tcW w:type="dxa" w:w="2268"/>
+          </w:tcPr>
+          <w:p>
+            <w:r>
+              <w:rPr>
+                <w:b/>
+                <w:sz w:val="16"/>
+              </w:rPr>
+              <w:t>Alojamentos para hospedagem com fins lucrativos destinados à reprodução/criação de animais potencialmente perigosos</w:t>
+            </w:r>
+          </w:p>
+        </w:tc>
+        <w:tc>
+          <w:tcPr>
+            <w:tcW w:type="dxa" w:w="3023"/>
+          </w:tcPr>
+          <w:p>
+            <w:r>
+              <w:rPr>
+                <w:b w:val="0"/>
+                <w:sz w:val="16"/>
+              </w:rPr>
+              <w:t>❌ Não previsto regime especial — comunicação prévia com prazo aplica-se a todos.</w:t>
+            </w:r>
+          </w:p>
+        </w:tc>
+        <w:tc>
+          <w:tcPr>
+            <w:tcW w:type="dxa" w:w="3024"/>
+          </w:tcPr>
+          <w:p>
+            <w:r>
+              <w:rPr>
+                <w:b w:val="0"/>
+                <w:sz w:val="16"/>
+              </w:rPr>
+              <w:t>✅ Sujeitos a permissão administrativa — al. b) do Art.º 31.º</w:t>
+            </w:r>
+          </w:p>
+        </w:tc>
+        <w:tc>
+          <w:tcPr>
+            <w:tcW w:type="dxa" w:w="3024"/>
+          </w:tcPr>
+          <w:p>
+            <w:r>
+              <w:rPr>
+                <w:b w:val="0"/>
+                <w:sz w:val="16"/>
+              </w:rPr>
+              <w:t>✅ Sujeitos a permissão administrativa — al. b) do n.º 1 do Art.º 3.º</w:t>
             </w:r>
           </w:p>
         </w:tc>
@@ -327,7 +435,7 @@
     </w:tbl>
     <w:p>
       <w:pPr>
-        <w:spacing w:after="0" w:before="0"/>
+        <w:spacing w:before="0" w:after="0"/>
       </w:pPr>
     </w:p>
     <w:p>
@@ -336,7 +444,7 @@
           <w:b/>
           <w:sz w:val="20"/>
         </w:rPr>
-        <w:t>2. Elementos informativos obrigatórios na notificação</w:t>
+        <w:t>2. Tipo e natureza do procedimento</w:t>
       </w:r>
     </w:p>
     <w:tbl>
@@ -410,7 +518,7 @@
               </w:rPr>
               <w:t>@legislacao</w:t>
               <w:br/>
-              <w:t>(legislação vigente)</w:t>
+              <w:t>(vigente)</w:t>
             </w:r>
           </w:p>
         </w:tc>
@@ -426,7 +534,7 @@
                 <w:b/>
                 <w:sz w:val="16"/>
               </w:rPr>
-              <w:t>Nome / denominação social</w:t>
+              <w:t>Designação do procedimento</w:t>
             </w:r>
           </w:p>
         </w:tc>
@@ -440,7 +548,9 @@
                 <w:b w:val="0"/>
                 <w:sz w:val="16"/>
               </w:rPr>
-              <w:t>Art.º 61.º, n.º 1, al. a)</w:t>
+              <w:t>"Comunicação prévia com prazo"</w:t>
+              <w:br/>
+              <w:t>(Art.º 60.º, n.º 1)</w:t>
             </w:r>
           </w:p>
         </w:tc>
@@ -454,7 +564,9 @@
                 <w:b w:val="0"/>
                 <w:sz w:val="16"/>
               </w:rPr>
-              <w:t>Art.º 33.º, al. a)</w:t>
+              <w:t>"Mera comunicação prévia"</w:t>
+              <w:br/>
+              <w:t>(Art.º 31.º, al. a))</w:t>
             </w:r>
           </w:p>
         </w:tc>
@@ -468,7 +580,9 @@
                 <w:b w:val="0"/>
                 <w:sz w:val="16"/>
               </w:rPr>
-              <w:t>Art.º 3.º-A, al. a)</w:t>
+              <w:t>"Mera comunicação prévia"</w:t>
+              <w:br/>
+              <w:t>(Art.º 3.º, n.º 1, al. a))</w:t>
             </w:r>
           </w:p>
         </w:tc>
@@ -484,7 +598,7 @@
                 <w:b/>
                 <w:sz w:val="16"/>
               </w:rPr>
-              <w:t>Localização e designação comercial</w:t>
+              <w:t>Momento de produção de efeitos</w:t>
             </w:r>
           </w:p>
         </w:tc>
@@ -498,7 +612,9 @@
                 <w:b w:val="0"/>
                 <w:sz w:val="16"/>
               </w:rPr>
-              <w:t>Art.º 61.º, n.º 1, al. b)</w:t>
+              <w:t>30 dias após o registo no balcão único eletrónico</w:t>
+              <w:br/>
+              <w:t>(Art.º 60.º, n.º 5)</w:t>
             </w:r>
           </w:p>
         </w:tc>
@@ -512,7 +628,7 @@
                 <w:b w:val="0"/>
                 <w:sz w:val="16"/>
               </w:rPr>
-              <w:t>Art.º 33.º, al. b)</w:t>
+              <w:t>Imediata — mera comunicação prévia produz efeitos no momento do registo.</w:t>
             </w:r>
           </w:p>
         </w:tc>
@@ -526,7 +642,7 @@
                 <w:b w:val="0"/>
                 <w:sz w:val="16"/>
               </w:rPr>
-              <w:t>Art.º 3.º-A, al. b)</w:t>
+              <w:t>Imediata — idem.</w:t>
             </w:r>
           </w:p>
         </w:tc>
@@ -542,7 +658,7 @@
                 <w:b/>
                 <w:sz w:val="16"/>
               </w:rPr>
-              <w:t>NIF / NIPC</w:t>
+              <w:t>Poder de indeferimento da autoridade</w:t>
             </w:r>
           </w:p>
         </w:tc>
@@ -556,7 +672,9 @@
                 <w:b w:val="0"/>
                 <w:sz w:val="16"/>
               </w:rPr>
-              <w:t>Art.º 61.º, n.º 1, al. c)</w:t>
+              <w:t>✅ DGAV pode emitir ato de indeferimento, total ou parcial, até 30 dias após registo</w:t>
+              <w:br/>
+              <w:t>(Art.º 60.º, n.º 6)</w:t>
             </w:r>
           </w:p>
         </w:tc>
@@ -570,7 +688,7 @@
                 <w:b w:val="0"/>
                 <w:sz w:val="16"/>
               </w:rPr>
-              <w:t>Art.º 33.º, al. c)</w:t>
+              <w:t>❌ Não previsto para a mera comunicação prévia.</w:t>
             </w:r>
           </w:p>
         </w:tc>
@@ -584,7 +702,7 @@
                 <w:b w:val="0"/>
                 <w:sz w:val="16"/>
               </w:rPr>
-              <w:t>Art.º 3.º-A, al. c)</w:t>
+              <w:t>❌ Não previsto para a mera comunicação prévia.</w:t>
             </w:r>
           </w:p>
         </w:tc>
@@ -600,7 +718,7 @@
                 <w:b/>
                 <w:sz w:val="16"/>
               </w:rPr>
-              <w:t>Caracterização das atividades</w:t>
+              <w:t>Número de identificação atribuído</w:t>
             </w:r>
           </w:p>
         </w:tc>
@@ -614,7 +732,9 @@
                 <w:b w:val="0"/>
                 <w:sz w:val="16"/>
               </w:rPr>
-              <w:t>Art.º 61.º, n.º 1, al. e)</w:t>
+              <w:t>"Número de identificação do alojamento" — do estabelecimento</w:t>
+              <w:br/>
+              <w:t>(Art.º 60.º, n.º 2)</w:t>
             </w:r>
           </w:p>
         </w:tc>
@@ -628,7 +748,7 @@
                 <w:b w:val="0"/>
                 <w:sz w:val="16"/>
               </w:rPr>
-              <w:t>Art.º 33.º, al. e)</w:t>
+              <w:t>❌ Não previsto número de identificação decorrente da mera comunicação prévia.</w:t>
             </w:r>
           </w:p>
         </w:tc>
@@ -642,7 +762,9 @@
                 <w:b w:val="0"/>
                 <w:sz w:val="16"/>
               </w:rPr>
-              <w:t>Art.º 3.º-A, al. e)</w:t>
+              <w:t>"Número de identificação" — pessoal e intransmissível</w:t>
+              <w:br/>
+              <w:t>(Art.º 3.º, n.º 11)</w:t>
             </w:r>
           </w:p>
         </w:tc>
@@ -658,7 +780,7 @@
                 <w:b/>
                 <w:sz w:val="16"/>
               </w:rPr>
-              <w:t>Médico veterinário responsável</w:t>
+              <w:t>Ressalva de obrigações fiscais</w:t>
             </w:r>
           </w:p>
         </w:tc>
@@ -672,7 +794,9 @@
                 <w:b w:val="0"/>
                 <w:sz w:val="16"/>
               </w:rPr>
-              <w:t>Art.º 61.º, n.º 1, al. f)</w:t>
+              <w:t>✅ Prevista expressamente</w:t>
+              <w:br/>
+              <w:t>(Art.º 60.º, n.º 3)</w:t>
             </w:r>
           </w:p>
         </w:tc>
@@ -686,9 +810,7 @@
                 <w:b w:val="0"/>
                 <w:sz w:val="16"/>
               </w:rPr>
-              <w:t>Art.º 33.º, al. f)</w:t>
-              <w:br/>
-              <w:t>(Art.º 32.º trata do MV responsável em separado)</w:t>
+              <w:t>❌ Ausente.</w:t>
             </w:r>
           </w:p>
         </w:tc>
@@ -702,355 +824,9 @@
                 <w:b w:val="0"/>
                 <w:sz w:val="16"/>
               </w:rPr>
-              <w:t>Art.º 3.º-A, al. f)</w:t>
-            </w:r>
-          </w:p>
-        </w:tc>
-      </w:tr>
-      <w:tr>
-        <w:tc>
-          <w:tcPr>
-            <w:tcW w:type="dxa" w:w="2268"/>
-          </w:tcPr>
-          <w:p>
-            <w:r>
-              <w:rPr>
-                <w:b/>
-                <w:sz w:val="16"/>
-              </w:rPr>
-              <w:t>Capacidade máxima de animais e espécies</w:t>
-            </w:r>
-          </w:p>
-        </w:tc>
-        <w:tc>
-          <w:tcPr>
-            <w:tcW w:type="dxa" w:w="3023"/>
-          </w:tcPr>
-          <w:p>
-            <w:r>
-              <w:rPr>
-                <w:b w:val="0"/>
-                <w:sz w:val="16"/>
-              </w:rPr>
-              <w:t>Art.º 61.º, n.º 1, al. h)</w:t>
-            </w:r>
-          </w:p>
-        </w:tc>
-        <w:tc>
-          <w:tcPr>
-            <w:tcW w:type="dxa" w:w="3024"/>
-          </w:tcPr>
-          <w:p>
-            <w:r>
-              <w:rPr>
-                <w:b w:val="0"/>
-                <w:sz w:val="16"/>
-              </w:rPr>
-              <w:t>Art.º 33.º, al. h)</w:t>
-            </w:r>
-          </w:p>
-        </w:tc>
-        <w:tc>
-          <w:tcPr>
-            <w:tcW w:type="dxa" w:w="3024"/>
-          </w:tcPr>
-          <w:p>
-            <w:r>
-              <w:rPr>
-                <w:b w:val="0"/>
-                <w:sz w:val="16"/>
-              </w:rPr>
-              <w:t>Art.º 3.º-A, al. h)</w:t>
-            </w:r>
-          </w:p>
-        </w:tc>
-      </w:tr>
-      <w:tr>
-        <w:tc>
-          <w:tcPr>
-            <w:tcW w:type="dxa" w:w="2268"/>
-          </w:tcPr>
-          <w:p>
-            <w:r>
-              <w:rPr>
-                <w:b/>
-                <w:sz w:val="16"/>
-              </w:rPr>
-              <w:t>Número de animais detidos, espécies e raças</w:t>
-            </w:r>
-          </w:p>
-        </w:tc>
-        <w:tc>
-          <w:tcPr>
-            <w:tcW w:type="dxa" w:w="3023"/>
-          </w:tcPr>
-          <w:p>
-            <w:r>
-              <w:rPr>
-                <w:b w:val="0"/>
-                <w:sz w:val="16"/>
-              </w:rPr>
-              <w:t>Art.º 61.º, n.º 1, al. i)</w:t>
-            </w:r>
-          </w:p>
-        </w:tc>
-        <w:tc>
-          <w:tcPr>
-            <w:tcW w:type="dxa" w:w="3024"/>
-          </w:tcPr>
-          <w:p>
-            <w:r>
-              <w:rPr>
-                <w:b w:val="0"/>
-                <w:sz w:val="16"/>
-              </w:rPr>
-              <w:t>Art.º 33.º, al. i)</w:t>
-            </w:r>
-          </w:p>
-        </w:tc>
-        <w:tc>
-          <w:tcPr>
-            <w:tcW w:type="dxa" w:w="3024"/>
-          </w:tcPr>
-          <w:p>
-            <w:r>
-              <w:rPr>
-                <w:b w:val="0"/>
-                <w:sz w:val="16"/>
-              </w:rPr>
-              <w:t>Art.º 3.º-A, al. i)</w:t>
-            </w:r>
-          </w:p>
-        </w:tc>
-      </w:tr>
-      <w:tr>
-        <w:tc>
-          <w:tcPr>
-            <w:tcW w:type="dxa" w:w="2268"/>
-          </w:tcPr>
-          <w:p>
-            <w:r>
-              <w:rPr>
-                <w:b/>
-                <w:sz w:val="16"/>
-              </w:rPr>
-              <w:t>Estimativa anual de ninhadas a colocar no mercado</w:t>
-            </w:r>
-          </w:p>
-        </w:tc>
-        <w:tc>
-          <w:tcPr>
-            <w:tcW w:type="dxa" w:w="3023"/>
-          </w:tcPr>
-          <w:p>
-            <w:r>
-              <w:rPr>
-                <w:b w:val="0"/>
-                <w:sz w:val="16"/>
-              </w:rPr>
-              <w:t>Ausente</w:t>
-            </w:r>
-          </w:p>
-        </w:tc>
-        <w:tc>
-          <w:tcPr>
-            <w:tcW w:type="dxa" w:w="3024"/>
-          </w:tcPr>
-          <w:p>
-            <w:r>
-              <w:rPr>
-                <w:b w:val="0"/>
-                <w:sz w:val="16"/>
-              </w:rPr>
-              <w:t>Ausente</w:t>
-            </w:r>
-          </w:p>
-        </w:tc>
-        <w:tc>
-          <w:tcPr>
-            <w:tcW w:type="dxa" w:w="3024"/>
-          </w:tcPr>
-          <w:p>
-            <w:r>
-              <w:rPr>
-                <w:b w:val="0"/>
-                <w:sz w:val="16"/>
-              </w:rPr>
-              <w:t>Ausente</w:t>
-            </w:r>
-          </w:p>
-        </w:tc>
-      </w:tr>
-      <w:tr>
-        <w:tc>
-          <w:tcPr>
-            <w:tcW w:type="dxa" w:w="2268"/>
-          </w:tcPr>
-          <w:p>
-            <w:r>
-              <w:rPr>
-                <w:b/>
-                <w:sz w:val="16"/>
-              </w:rPr>
-              <w:t>Celas de quarentena (centros de recolha)</w:t>
-            </w:r>
-          </w:p>
-        </w:tc>
-        <w:tc>
-          <w:tcPr>
-            <w:tcW w:type="dxa" w:w="3023"/>
-          </w:tcPr>
-          <w:p>
-            <w:r>
-              <w:rPr>
-                <w:b w:val="0"/>
-                <w:sz w:val="16"/>
-              </w:rPr>
-              <w:t>Art.º 61.º, n.º 1, al. g)</w:t>
-            </w:r>
-          </w:p>
-        </w:tc>
-        <w:tc>
-          <w:tcPr>
-            <w:tcW w:type="dxa" w:w="3024"/>
-          </w:tcPr>
-          <w:p>
-            <w:r>
-              <w:rPr>
-                <w:b w:val="0"/>
-                <w:sz w:val="16"/>
-              </w:rPr>
-              <w:t>Art.º 33.º, al. g)</w:t>
-            </w:r>
-          </w:p>
-        </w:tc>
-        <w:tc>
-          <w:tcPr>
-            <w:tcW w:type="dxa" w:w="3024"/>
-          </w:tcPr>
-          <w:p>
-            <w:r>
-              <w:rPr>
-                <w:b w:val="0"/>
-                <w:sz w:val="16"/>
-              </w:rPr>
-              <w:t>Art.º 3.º-A, al. g)</w:t>
-            </w:r>
-          </w:p>
-        </w:tc>
-      </w:tr>
-      <w:tr>
-        <w:tc>
-          <w:tcPr>
-            <w:tcW w:type="dxa" w:w="2268"/>
-          </w:tcPr>
-          <w:p>
-            <w:r>
-              <w:rPr>
-                <w:b/>
-                <w:sz w:val="16"/>
-              </w:rPr>
-              <w:t>Parecer do MV sobre condições higiossanitárias</w:t>
-            </w:r>
-          </w:p>
-        </w:tc>
-        <w:tc>
-          <w:tcPr>
-            <w:tcW w:type="dxa" w:w="3023"/>
-          </w:tcPr>
-          <w:p>
-            <w:r>
-              <w:rPr>
-                <w:b w:val="0"/>
-                <w:sz w:val="16"/>
-              </w:rPr>
-              <w:t>Art.º 61.º, n.º 1, al. j)</w:t>
-            </w:r>
-          </w:p>
-        </w:tc>
-        <w:tc>
-          <w:tcPr>
-            <w:tcW w:type="dxa" w:w="3024"/>
-          </w:tcPr>
-          <w:p>
-            <w:r>
-              <w:rPr>
-                <w:b w:val="0"/>
-                <w:sz w:val="16"/>
-              </w:rPr>
-              <w:t>Ausente</w:t>
-            </w:r>
-          </w:p>
-        </w:tc>
-        <w:tc>
-          <w:tcPr>
-            <w:tcW w:type="dxa" w:w="3024"/>
-          </w:tcPr>
-          <w:p>
-            <w:r>
-              <w:rPr>
-                <w:b w:val="0"/>
-                <w:sz w:val="16"/>
-              </w:rPr>
-              <w:t>Ausente</w:t>
-            </w:r>
-          </w:p>
-        </w:tc>
-      </w:tr>
-      <w:tr>
-        <w:tc>
-          <w:tcPr>
-            <w:tcW w:type="dxa" w:w="2268"/>
-          </w:tcPr>
-          <w:p>
-            <w:r>
-              <w:rPr>
-                <w:b/>
-                <w:sz w:val="16"/>
-              </w:rPr>
-              <w:t>Declaração de responsabilidade</w:t>
-            </w:r>
-          </w:p>
-        </w:tc>
-        <w:tc>
-          <w:tcPr>
-            <w:tcW w:type="dxa" w:w="3023"/>
-          </w:tcPr>
-          <w:p>
-            <w:r>
-              <w:rPr>
-                <w:b w:val="0"/>
-                <w:sz w:val="16"/>
-              </w:rPr>
-              <w:t>Art.º 61.º, n.º 1, al. k)</w:t>
-            </w:r>
-          </w:p>
-        </w:tc>
-        <w:tc>
-          <w:tcPr>
-            <w:tcW w:type="dxa" w:w="3024"/>
-          </w:tcPr>
-          <w:p>
-            <w:r>
-              <w:rPr>
-                <w:b w:val="0"/>
-                <w:sz w:val="16"/>
-              </w:rPr>
-              <w:t>Art.º 33.º, al. j)</w:t>
-            </w:r>
-          </w:p>
-        </w:tc>
-        <w:tc>
-          <w:tcPr>
-            <w:tcW w:type="dxa" w:w="3024"/>
-          </w:tcPr>
-          <w:p>
-            <w:r>
-              <w:rPr>
-                <w:b w:val="0"/>
-                <w:sz w:val="16"/>
-              </w:rPr>
-              <w:t>Art.º 3.º-A, al. j)</w:t>
+              <w:t>✅ Prevista expressamente</w:t>
+              <w:br/>
+              <w:t>(Art.º 3.º, n.º 13)</w:t>
             </w:r>
           </w:p>
         </w:tc>
@@ -1058,7 +834,7 @@
     </w:tbl>
     <w:p>
       <w:pPr>
-        <w:spacing w:after="0" w:before="0"/>
+        <w:spacing w:before="0" w:after="0"/>
       </w:pPr>
     </w:p>
     <w:p>
@@ -1067,7 +843,7 @@
           <w:b/>
           <w:sz w:val="20"/>
         </w:rPr>
-        <w:t>3. Comunicação de alterações de funcionamento</w:t>
+        <w:t>3. Elementos informativos da comunicação — análise alínea a alínea</w:t>
       </w:r>
     </w:p>
     <w:tbl>
@@ -1141,7 +917,7 @@
               </w:rPr>
               <w:t>@legislacao</w:t>
               <w:br/>
-              <w:t>(legislação vigente)</w:t>
+              <w:t>(vigente)</w:t>
             </w:r>
           </w:p>
         </w:tc>
@@ -1157,7 +933,7 @@
                 <w:b/>
                 <w:sz w:val="16"/>
               </w:rPr>
-              <w:t>Prazo de comunicação</w:t>
+              <w:t>a) Nome / denominação social</w:t>
             </w:r>
           </w:p>
         </w:tc>
@@ -1171,9 +947,7 @@
                 <w:b w:val="0"/>
                 <w:sz w:val="16"/>
               </w:rPr>
-              <w:t>15 dias após ocorrência</w:t>
-              <w:br/>
-              <w:t>(Art.º 63.º, n.º 1)</w:t>
+              <w:t>✅ Art.º 61.º, n.º 1, al. a)</w:t>
             </w:r>
           </w:p>
         </w:tc>
@@ -1187,9 +961,7 @@
                 <w:b w:val="0"/>
                 <w:sz w:val="16"/>
               </w:rPr>
-              <w:t>15 dias após ocorrência</w:t>
-              <w:br/>
-              <w:t>(Art.º 38.º, n.º 1)</w:t>
+              <w:t>✅ Art.º 33.º, al. a)</w:t>
             </w:r>
           </w:p>
         </w:tc>
@@ -1203,9 +975,7 @@
                 <w:b w:val="0"/>
                 <w:sz w:val="16"/>
               </w:rPr>
-              <w:t>15 dias após ocorrência</w:t>
-              <w:br/>
-              <w:t>(Art.º 3.º-F, n.º 1)</w:t>
+              <w:t>✅ Art.º 3.º-A, al. a)</w:t>
             </w:r>
           </w:p>
         </w:tc>
@@ -1221,7 +991,7 @@
                 <w:b/>
                 <w:sz w:val="16"/>
               </w:rPr>
-              <w:t>Via de comunicação</w:t>
+              <w:t>b) Localização e designação comercial</w:t>
             </w:r>
           </w:p>
         </w:tc>
@@ -1235,9 +1005,7 @@
                 <w:b w:val="0"/>
                 <w:sz w:val="16"/>
               </w:rPr>
-              <w:t>Via eletrónica — balcão único eletrónico</w:t>
-              <w:br/>
-              <w:t>(Art.º 63.º, n.º 1)</w:t>
+              <w:t>✅ Art.º 61.º, n.º 1, al. b)</w:t>
             </w:r>
           </w:p>
         </w:tc>
@@ -1251,9 +1019,7 @@
                 <w:b w:val="0"/>
                 <w:sz w:val="16"/>
               </w:rPr>
-              <w:t>Comunicação à DGAV; sem referência expressa a via eletrónica</w:t>
-              <w:br/>
-              <w:t>(Art.º 38.º, n.º 1)</w:t>
+              <w:t>✅ Art.º 33.º, al. b)</w:t>
             </w:r>
           </w:p>
         </w:tc>
@@ -1267,9 +1033,7 @@
                 <w:b w:val="0"/>
                 <w:sz w:val="16"/>
               </w:rPr>
-              <w:t>Via eletrónica — balcão único eletrónico</w:t>
-              <w:br/>
-              <w:t>(Art.º 3.º-F, n.º 1)</w:t>
+              <w:t>✅ Art.º 3.º-A, al. b)</w:t>
             </w:r>
           </w:p>
         </w:tc>
@@ -1285,7 +1049,7 @@
                 <w:b/>
                 <w:sz w:val="16"/>
               </w:rPr>
-              <w:t>Âmbito das alterações a comunicar</w:t>
+              <w:t>c) NIF / NIPC</w:t>
             </w:r>
           </w:p>
         </w:tc>
@@ -1299,9 +1063,7 @@
                 <w:b w:val="0"/>
                 <w:sz w:val="16"/>
               </w:rPr>
-              <w:t>Qualquer modificação de elementos do n.º 1 do Art.º 61.º</w:t>
-              <w:br/>
-              <w:t>(Art.º 63.º, n.º 1)</w:t>
+              <w:t>✅ Art.º 61.º, n.º 1, al. c)</w:t>
             </w:r>
           </w:p>
         </w:tc>
@@ -1315,9 +1077,7 @@
                 <w:b w:val="0"/>
                 <w:sz w:val="16"/>
               </w:rPr>
-              <w:t>Modificação estrutural, transferência de titularidade, cessão de exploração, cessação da atividade, alteração do MV responsável</w:t>
-              <w:br/>
-              <w:t>(Art.º 38.º, n.º 1)</w:t>
+              <w:t>✅ Art.º 33.º, al. c)</w:t>
             </w:r>
           </w:p>
         </w:tc>
@@ -1331,9 +1091,7 @@
                 <w:b w:val="0"/>
                 <w:sz w:val="16"/>
               </w:rPr>
-              <w:t>Modificação estrutural, transferência de titularidade, cessão de exploração, cessação da atividade, alteração do MV responsável</w:t>
-              <w:br/>
-              <w:t>(Art.º 3.º-F, n.º 1)</w:t>
+              <w:t>✅ Art.º 3.º-A, al. c)</w:t>
             </w:r>
           </w:p>
         </w:tc>
@@ -1349,7 +1107,7 @@
                 <w:b/>
                 <w:sz w:val="16"/>
               </w:rPr>
-              <w:t>Obras de modificação estrutural</w:t>
+              <w:t>d) Municípios integrantes (centros intermunicipais)</w:t>
             </w:r>
           </w:p>
         </w:tc>
@@ -1363,9 +1121,9 @@
                 <w:b w:val="0"/>
                 <w:sz w:val="16"/>
               </w:rPr>
-              <w:t>Comunicação acompanhada de plantas</w:t>
+              <w:t>✅ Art.º 61.º, n.º 1, al. d)</w:t>
               <w:br/>
-              <w:t>(Art.º 63.º, n.º 2)</w:t>
+              <w:t>(centros de bem-estar animal intermunicipais)</w:t>
             </w:r>
           </w:p>
         </w:tc>
@@ -1379,9 +1137,9 @@
                 <w:b w:val="0"/>
                 <w:sz w:val="16"/>
               </w:rPr>
-              <w:t>Comunicação acompanhada de plantas</w:t>
+              <w:t>✅ Art.º 33.º, al. d)</w:t>
               <w:br/>
-              <w:t>(Art.º 38.º, n.º 2)</w:t>
+              <w:t>(centros de recolha intermunicipais)</w:t>
             </w:r>
           </w:p>
         </w:tc>
@@ -1395,9 +1153,427 @@
                 <w:b w:val="0"/>
                 <w:sz w:val="16"/>
               </w:rPr>
-              <w:t>Comunicação acompanhada de plantas</w:t>
+              <w:t>✅ Art.º 3.º-A, al. d)</w:t>
               <w:br/>
-              <w:t>(Art.º 3.º-F, n.º 2)</w:t>
+              <w:t>(centros de recolha intermunicipais)</w:t>
+            </w:r>
+          </w:p>
+        </w:tc>
+      </w:tr>
+      <w:tr>
+        <w:tc>
+          <w:tcPr>
+            <w:tcW w:type="dxa" w:w="2268"/>
+          </w:tcPr>
+          <w:p>
+            <w:r>
+              <w:rPr>
+                <w:b/>
+                <w:sz w:val="16"/>
+              </w:rPr>
+              <w:t>e) Caracterização das atividades a exercer</w:t>
+            </w:r>
+          </w:p>
+        </w:tc>
+        <w:tc>
+          <w:tcPr>
+            <w:tcW w:type="dxa" w:w="3023"/>
+          </w:tcPr>
+          <w:p>
+            <w:r>
+              <w:rPr>
+                <w:b w:val="0"/>
+                <w:sz w:val="16"/>
+              </w:rPr>
+              <w:t>✅ Art.º 61.º, n.º 1, al. e)</w:t>
+            </w:r>
+          </w:p>
+        </w:tc>
+        <w:tc>
+          <w:tcPr>
+            <w:tcW w:type="dxa" w:w="3024"/>
+          </w:tcPr>
+          <w:p>
+            <w:r>
+              <w:rPr>
+                <w:b w:val="0"/>
+                <w:sz w:val="16"/>
+              </w:rPr>
+              <w:t>✅ Art.º 33.º, al. e)</w:t>
+            </w:r>
+          </w:p>
+        </w:tc>
+        <w:tc>
+          <w:tcPr>
+            <w:tcW w:type="dxa" w:w="3024"/>
+          </w:tcPr>
+          <w:p>
+            <w:r>
+              <w:rPr>
+                <w:b w:val="0"/>
+                <w:sz w:val="16"/>
+              </w:rPr>
+              <w:t>✅ Art.º 3.º-A, al. e)</w:t>
+            </w:r>
+          </w:p>
+        </w:tc>
+      </w:tr>
+      <w:tr>
+        <w:tc>
+          <w:tcPr>
+            <w:tcW w:type="dxa" w:w="2268"/>
+          </w:tcPr>
+          <w:p>
+            <w:r>
+              <w:rPr>
+                <w:b/>
+                <w:sz w:val="16"/>
+              </w:rPr>
+              <w:t>f) Médico veterinário responsável</w:t>
+            </w:r>
+          </w:p>
+        </w:tc>
+        <w:tc>
+          <w:tcPr>
+            <w:tcW w:type="dxa" w:w="3023"/>
+          </w:tcPr>
+          <w:p>
+            <w:r>
+              <w:rPr>
+                <w:b w:val="0"/>
+                <w:sz w:val="16"/>
+              </w:rPr>
+              <w:t>✅ Art.º 61.º, n.º 1, al. f)</w:t>
+            </w:r>
+          </w:p>
+        </w:tc>
+        <w:tc>
+          <w:tcPr>
+            <w:tcW w:type="dxa" w:w="3024"/>
+          </w:tcPr>
+          <w:p>
+            <w:r>
+              <w:rPr>
+                <w:b w:val="0"/>
+                <w:sz w:val="16"/>
+              </w:rPr>
+              <w:t>✅ Art.º 33.º, al. f)</w:t>
+            </w:r>
+          </w:p>
+        </w:tc>
+        <w:tc>
+          <w:tcPr>
+            <w:tcW w:type="dxa" w:w="3024"/>
+          </w:tcPr>
+          <w:p>
+            <w:r>
+              <w:rPr>
+                <w:b w:val="0"/>
+                <w:sz w:val="16"/>
+              </w:rPr>
+              <w:t>✅ Art.º 3.º-A, al. f)</w:t>
+            </w:r>
+          </w:p>
+        </w:tc>
+      </w:tr>
+      <w:tr>
+        <w:tc>
+          <w:tcPr>
+            <w:tcW w:type="dxa" w:w="2268"/>
+          </w:tcPr>
+          <w:p>
+            <w:r>
+              <w:rPr>
+                <w:b/>
+                <w:sz w:val="16"/>
+              </w:rPr>
+              <w:t>g) Celas de quarentena</w:t>
+            </w:r>
+          </w:p>
+        </w:tc>
+        <w:tc>
+          <w:tcPr>
+            <w:tcW w:type="dxa" w:w="3023"/>
+          </w:tcPr>
+          <w:p>
+            <w:r>
+              <w:rPr>
+                <w:b w:val="0"/>
+                <w:sz w:val="16"/>
+              </w:rPr>
+              <w:t>✅ Art.º 61.º, n.º 1, al. g)</w:t>
+              <w:br/>
+              <w:t>(no caso dos centros de bem-estar animal)</w:t>
+            </w:r>
+          </w:p>
+        </w:tc>
+        <w:tc>
+          <w:tcPr>
+            <w:tcW w:type="dxa" w:w="3024"/>
+          </w:tcPr>
+          <w:p>
+            <w:r>
+              <w:rPr>
+                <w:b w:val="0"/>
+                <w:sz w:val="16"/>
+              </w:rPr>
+              <w:t>✅ Art.º 33.º, al. g)</w:t>
+              <w:br/>
+              <w:t>(no caso dos centros de recolha)</w:t>
+            </w:r>
+          </w:p>
+        </w:tc>
+        <w:tc>
+          <w:tcPr>
+            <w:tcW w:type="dxa" w:w="3024"/>
+          </w:tcPr>
+          <w:p>
+            <w:r>
+              <w:rPr>
+                <w:b w:val="0"/>
+                <w:sz w:val="16"/>
+              </w:rPr>
+              <w:t>✅ Art.º 3.º-A, al. g)</w:t>
+              <w:br/>
+              <w:t>(no caso dos centros de recolha)</w:t>
+            </w:r>
+          </w:p>
+        </w:tc>
+      </w:tr>
+      <w:tr>
+        <w:tc>
+          <w:tcPr>
+            <w:tcW w:type="dxa" w:w="2268"/>
+          </w:tcPr>
+          <w:p>
+            <w:r>
+              <w:rPr>
+                <w:b/>
+                <w:sz w:val="16"/>
+              </w:rPr>
+              <w:t>h) Capacidade máxima de animais e espécies</w:t>
+            </w:r>
+          </w:p>
+        </w:tc>
+        <w:tc>
+          <w:tcPr>
+            <w:tcW w:type="dxa" w:w="3023"/>
+          </w:tcPr>
+          <w:p>
+            <w:r>
+              <w:rPr>
+                <w:b w:val="0"/>
+                <w:sz w:val="16"/>
+              </w:rPr>
+              <w:t>✅ Art.º 61.º, n.º 1, al. h)</w:t>
+            </w:r>
+          </w:p>
+        </w:tc>
+        <w:tc>
+          <w:tcPr>
+            <w:tcW w:type="dxa" w:w="3024"/>
+          </w:tcPr>
+          <w:p>
+            <w:r>
+              <w:rPr>
+                <w:b w:val="0"/>
+                <w:sz w:val="16"/>
+              </w:rPr>
+              <w:t>✅ Art.º 33.º, al. h)</w:t>
+            </w:r>
+          </w:p>
+        </w:tc>
+        <w:tc>
+          <w:tcPr>
+            <w:tcW w:type="dxa" w:w="3024"/>
+          </w:tcPr>
+          <w:p>
+            <w:r>
+              <w:rPr>
+                <w:b w:val="0"/>
+                <w:sz w:val="16"/>
+              </w:rPr>
+              <w:t>✅ Art.º 3.º-A, al. h)</w:t>
+            </w:r>
+          </w:p>
+        </w:tc>
+      </w:tr>
+      <w:tr>
+        <w:tc>
+          <w:tcPr>
+            <w:tcW w:type="dxa" w:w="2268"/>
+          </w:tcPr>
+          <w:p>
+            <w:r>
+              <w:rPr>
+                <w:b/>
+                <w:sz w:val="16"/>
+              </w:rPr>
+              <w:t>i) N.º de animais detidos, espécies e raças</w:t>
+            </w:r>
+          </w:p>
+        </w:tc>
+        <w:tc>
+          <w:tcPr>
+            <w:tcW w:type="dxa" w:w="3023"/>
+          </w:tcPr>
+          <w:p>
+            <w:r>
+              <w:rPr>
+                <w:b w:val="0"/>
+                <w:sz w:val="16"/>
+              </w:rPr>
+              <w:t>✅ Art.º 61.º, n.º 1, al. i)</w:t>
+            </w:r>
+          </w:p>
+        </w:tc>
+        <w:tc>
+          <w:tcPr>
+            <w:tcW w:type="dxa" w:w="3024"/>
+          </w:tcPr>
+          <w:p>
+            <w:r>
+              <w:rPr>
+                <w:b w:val="0"/>
+                <w:sz w:val="16"/>
+              </w:rPr>
+              <w:t>✅ Art.º 33.º, al. i)</w:t>
+            </w:r>
+          </w:p>
+        </w:tc>
+        <w:tc>
+          <w:tcPr>
+            <w:tcW w:type="dxa" w:w="3024"/>
+          </w:tcPr>
+          <w:p>
+            <w:r>
+              <w:rPr>
+                <w:b w:val="0"/>
+                <w:sz w:val="16"/>
+              </w:rPr>
+              <w:t>✅ Art.º 3.º-A, al. i)</w:t>
+            </w:r>
+          </w:p>
+        </w:tc>
+      </w:tr>
+      <w:tr>
+        <w:tc>
+          <w:tcPr>
+            <w:tcW w:type="dxa" w:w="2268"/>
+          </w:tcPr>
+          <w:p>
+            <w:r>
+              <w:rPr>
+                <w:b/>
+                <w:sz w:val="16"/>
+              </w:rPr>
+              <w:t>j) Parecer do MV sobre condições higiossanitárias e de bem-estar</w:t>
+            </w:r>
+          </w:p>
+        </w:tc>
+        <w:tc>
+          <w:tcPr>
+            <w:tcW w:type="dxa" w:w="3023"/>
+          </w:tcPr>
+          <w:p>
+            <w:r>
+              <w:rPr>
+                <w:b w:val="0"/>
+                <w:sz w:val="16"/>
+              </w:rPr>
+              <w:t>✅ Art.º 61.º, n.º 1, al. j) — EXCLUSIVO do @rgbeac</w:t>
+            </w:r>
+          </w:p>
+        </w:tc>
+        <w:tc>
+          <w:tcPr>
+            <w:tcW w:type="dxa" w:w="3024"/>
+          </w:tcPr>
+          <w:p>
+            <w:r>
+              <w:rPr>
+                <w:b w:val="0"/>
+                <w:sz w:val="16"/>
+              </w:rPr>
+              <w:t>❌ Ausente</w:t>
+            </w:r>
+          </w:p>
+        </w:tc>
+        <w:tc>
+          <w:tcPr>
+            <w:tcW w:type="dxa" w:w="3024"/>
+          </w:tcPr>
+          <w:p>
+            <w:r>
+              <w:rPr>
+                <w:b w:val="0"/>
+                <w:sz w:val="16"/>
+              </w:rPr>
+              <w:t>❌ Ausente</w:t>
+            </w:r>
+          </w:p>
+        </w:tc>
+      </w:tr>
+      <w:tr>
+        <w:tc>
+          <w:tcPr>
+            <w:tcW w:type="dxa" w:w="2268"/>
+          </w:tcPr>
+          <w:p>
+            <w:r>
+              <w:rPr>
+                <w:b/>
+                <w:sz w:val="16"/>
+              </w:rPr>
+              <w:t>k/j) Declaração de responsabilidade — fórmula</w:t>
+            </w:r>
+          </w:p>
+        </w:tc>
+        <w:tc>
+          <w:tcPr>
+            <w:tcW w:type="dxa" w:w="3023"/>
+          </w:tcPr>
+          <w:p>
+            <w:r>
+              <w:rPr>
+                <w:b w:val="0"/>
+                <w:sz w:val="16"/>
+              </w:rPr>
+              <w:t>"cumprimento do presente decreto-lei e demais legislação aplicável aos animais de companhia"</w:t>
+              <w:br/>
+              <w:t>(Art.º 61.º, n.º 1, al. k))</w:t>
+            </w:r>
+          </w:p>
+        </w:tc>
+        <w:tc>
+          <w:tcPr>
+            <w:tcW w:type="dxa" w:w="3024"/>
+          </w:tcPr>
+          <w:p>
+            <w:r>
+              <w:rPr>
+                <w:b w:val="0"/>
+                <w:sz w:val="16"/>
+              </w:rPr>
+              <w:t>"cumprimento de toda a legislação aplicável aos animais de companhia, nomeadamente em matéria de instalações, equipamentos, higiene, saúde e bem-estar dos animais"</w:t>
+              <w:br/>
+              <w:t>(Art.º 33.º, al. j))</w:t>
+            </w:r>
+          </w:p>
+        </w:tc>
+        <w:tc>
+          <w:tcPr>
+            <w:tcW w:type="dxa" w:w="3024"/>
+          </w:tcPr>
+          <w:p>
+            <w:r>
+              <w:rPr>
+                <w:b w:val="0"/>
+                <w:sz w:val="16"/>
+              </w:rPr>
+              <w:t>"cumprimento da legislação aplicável aos animais de companhia, nomeadamente em matéria de instalações, equipamentos, higiene, saúde e bem-estar dos animais"</w:t>
+              <w:br/>
+              <w:t>(Art.º 3.º-A, al. j))</w:t>
             </w:r>
           </w:p>
         </w:tc>
@@ -1405,7 +1581,7 @@
     </w:tbl>
     <w:p>
       <w:pPr>
-        <w:spacing w:after="0" w:before="0"/>
+        <w:spacing w:before="0" w:after="0"/>
       </w:pPr>
     </w:p>
     <w:p>
@@ -1414,7 +1590,7 @@
           <w:b/>
           <w:sz w:val="20"/>
         </w:rPr>
-        <w:t>4. Cessação de atividade — pré-aviso pelo operador</w:t>
+        <w:t>4. Verificação do cumprimento dos requisitos e via de comunicação</w:t>
       </w:r>
     </w:p>
     <w:tbl>
@@ -1488,7 +1664,7 @@
               </w:rPr>
               <w:t>@legislacao</w:t>
               <w:br/>
-              <w:t>(legislação vigente)</w:t>
+              <w:t>(vigente)</w:t>
             </w:r>
           </w:p>
         </w:tc>
@@ -1504,7 +1680,7 @@
                 <w:b/>
                 <w:sz w:val="16"/>
               </w:rPr>
-              <w:t>Pré-aviso obrigatório pelo operador antes da cessação</w:t>
+              <w:t>Verificação por vistoria após comunicação inicial</w:t>
             </w:r>
           </w:p>
         </w:tc>
@@ -1518,9 +1694,9 @@
                 <w:b w:val="0"/>
                 <w:sz w:val="16"/>
               </w:rPr>
-              <w:t>Não previsto</w:t>
+              <w:t>✅ Prevista — vistoria pelo ICNF, I.P. (referência ao DGAV) ou entidade mandatada</w:t>
               <w:br/>
-              <w:t>(encerramento compulsivo determinado pela DGAV — Art.º 64.º)</w:t>
+              <w:t>(Art.º 61.º, n.º 2)</w:t>
             </w:r>
           </w:p>
         </w:tc>
@@ -1534,9 +1710,7 @@
                 <w:b w:val="0"/>
                 <w:sz w:val="16"/>
               </w:rPr>
-              <w:t>Não previsto</w:t>
-              <w:br/>
-              <w:t>(encerramento compulsivo determinado pelo DGAV — Art.º 39.º)</w:t>
+              <w:t>❌ Não prevista para mera comunicação prévia (só para permissão adm. — Art.º 35.º).</w:t>
             </w:r>
           </w:p>
         </w:tc>
@@ -1550,9 +1724,133 @@
                 <w:b w:val="0"/>
                 <w:sz w:val="16"/>
               </w:rPr>
-              <w:t>Não previsto</w:t>
+              <w:t>❌ Não prevista para mera comunicação prévia (só para permissão adm. — Art.º 3.º-C).</w:t>
+            </w:r>
+          </w:p>
+        </w:tc>
+      </w:tr>
+      <w:tr>
+        <w:tc>
+          <w:tcPr>
+            <w:tcW w:type="dxa" w:w="2268"/>
+          </w:tcPr>
+          <w:p>
+            <w:r>
+              <w:rPr>
+                <w:b/>
+                <w:sz w:val="16"/>
+              </w:rPr>
+              <w:t>Via eletrónica para a comunicação inicial</w:t>
+            </w:r>
+          </w:p>
+        </w:tc>
+        <w:tc>
+          <w:tcPr>
+            <w:tcW w:type="dxa" w:w="3023"/>
+          </w:tcPr>
+          <w:p>
+            <w:r>
+              <w:rPr>
+                <w:b w:val="0"/>
+                <w:sz w:val="16"/>
+              </w:rPr>
+              <w:t>✅ Obrigatória — balcão único eletrónico</w:t>
               <w:br/>
-              <w:t>(encerramento compulsivo determinado pelo DGAV — Art.º 3.º-G)</w:t>
+              <w:t>(Art.º 61.º, n.º 3)</w:t>
+            </w:r>
+          </w:p>
+        </w:tc>
+        <w:tc>
+          <w:tcPr>
+            <w:tcW w:type="dxa" w:w="3024"/>
+          </w:tcPr>
+          <w:p>
+            <w:r>
+              <w:rPr>
+                <w:b w:val="0"/>
+                <w:sz w:val="16"/>
+              </w:rPr>
+              <w:t>❌ Não prevista para mera comunicação prévia</w:t>
+              <w:br/>
+              <w:t>(só para permissão adm. — Art.º 34.º, n.º 3)</w:t>
+            </w:r>
+          </w:p>
+        </w:tc>
+        <w:tc>
+          <w:tcPr>
+            <w:tcW w:type="dxa" w:w="3024"/>
+          </w:tcPr>
+          <w:p>
+            <w:r>
+              <w:rPr>
+                <w:b w:val="0"/>
+                <w:sz w:val="16"/>
+              </w:rPr>
+              <w:t>❌ Não prevista para mera comunicação prévia</w:t>
+              <w:br/>
+              <w:t>(só para alterações — Art.º 3.º-F, n.º 1)</w:t>
+            </w:r>
+          </w:p>
+        </w:tc>
+      </w:tr>
+      <w:tr>
+        <w:tc>
+          <w:tcPr>
+            <w:tcW w:type="dxa" w:w="2268"/>
+          </w:tcPr>
+          <w:p>
+            <w:r>
+              <w:rPr>
+                <w:b/>
+                <w:sz w:val="16"/>
+              </w:rPr>
+              <w:t>Fallback em caso de indisponibilidade das plataformas eletrónicas</w:t>
+            </w:r>
+          </w:p>
+        </w:tc>
+        <w:tc>
+          <w:tcPr>
+            <w:tcW w:type="dxa" w:w="3023"/>
+          </w:tcPr>
+          <w:p>
+            <w:r>
+              <w:rPr>
+                <w:b w:val="0"/>
+                <w:sz w:val="16"/>
+              </w:rPr>
+              <w:t>✅ Previsto — "qualquer outro meio previsto na lei"</w:t>
+              <w:br/>
+              <w:t>(Art.º 61.º, n.º 4)</w:t>
+            </w:r>
+          </w:p>
+        </w:tc>
+        <w:tc>
+          <w:tcPr>
+            <w:tcW w:type="dxa" w:w="3024"/>
+          </w:tcPr>
+          <w:p>
+            <w:r>
+              <w:rPr>
+                <w:b w:val="0"/>
+                <w:sz w:val="16"/>
+              </w:rPr>
+              <w:t>❌ Não previsto para a comunicação prévia inicial.</w:t>
+            </w:r>
+          </w:p>
+        </w:tc>
+        <w:tc>
+          <w:tcPr>
+            <w:tcW w:type="dxa" w:w="3024"/>
+          </w:tcPr>
+          <w:p>
+            <w:r>
+              <w:rPr>
+                <w:b w:val="0"/>
+                <w:sz w:val="16"/>
+              </w:rPr>
+              <w:t>❌ Não previsto para a comunicação prévia inicial</w:t>
+              <w:br/>
+              <w:t>(só para alterações — Art.º 3.º-F, n.º 4)</w:t>
             </w:r>
           </w:p>
         </w:tc>
@@ -1560,7 +1858,7 @@
     </w:tbl>
     <w:p>
       <w:pPr>
-        <w:spacing w:after="0" w:before="0"/>
+        <w:spacing w:before="0" w:after="0"/>
       </w:pPr>
     </w:p>
     <w:p>
@@ -1569,7 +1867,7 @@
           <w:b/>
           <w:sz w:val="20"/>
         </w:rPr>
-        <w:t>5. Suspensão e encerramento determinado pela autoridade</w:t>
+        <w:t>5. Alterações de funcionamento</w:t>
       </w:r>
     </w:p>
     <w:tbl>
@@ -1643,7 +1941,7 @@
               </w:rPr>
               <w:t>@legislacao</w:t>
               <w:br/>
-              <w:t>(legislação vigente)</w:t>
+              <w:t>(vigente)</w:t>
             </w:r>
           </w:p>
         </w:tc>
@@ -1659,7 +1957,7 @@
                 <w:b/>
                 <w:sz w:val="16"/>
               </w:rPr>
-              <w:t>Causas de suspensão/encerramento</w:t>
+              <w:t>Âmbito das alterações a comunicar</w:t>
             </w:r>
           </w:p>
         </w:tc>
@@ -1673,7 +1971,354 @@
                 <w:b w:val="0"/>
                 <w:sz w:val="16"/>
               </w:rPr>
-              <w:t>a) Riscos higiossanitários; b) Maus-tratos; c) Graves problemas de saúde/bem-estar; d) Falta de condições de segurança</w:t>
+              <w:t>Qualquer modificação de "qualquer dos elementos previstos no n.º 1 do art.º 61.º" — âmbito mais amplo</w:t>
+              <w:br/>
+              <w:t>(Art.º 63.º, n.º 1)</w:t>
+            </w:r>
+          </w:p>
+        </w:tc>
+        <w:tc>
+          <w:tcPr>
+            <w:tcW w:type="dxa" w:w="3024"/>
+          </w:tcPr>
+          <w:p>
+            <w:r>
+              <w:rPr>
+                <w:b w:val="0"/>
+                <w:sz w:val="16"/>
+              </w:rPr>
+              <w:t>Tipificado: modificação estrutural, transferência de titularidade, cessão de exploração, cessação da atividade, alteração do MV responsável</w:t>
+              <w:br/>
+              <w:t>(Art.º 38.º, n.º 1)</w:t>
+            </w:r>
+          </w:p>
+        </w:tc>
+        <w:tc>
+          <w:tcPr>
+            <w:tcW w:type="dxa" w:w="3024"/>
+          </w:tcPr>
+          <w:p>
+            <w:r>
+              <w:rPr>
+                <w:b w:val="0"/>
+                <w:sz w:val="16"/>
+              </w:rPr>
+              <w:t>Tipificado: idem @codigo</w:t>
+              <w:br/>
+              <w:t>(Art.º 3.º-F, n.º 1)</w:t>
+            </w:r>
+          </w:p>
+        </w:tc>
+      </w:tr>
+      <w:tr>
+        <w:tc>
+          <w:tcPr>
+            <w:tcW w:type="dxa" w:w="2268"/>
+          </w:tcPr>
+          <w:p>
+            <w:r>
+              <w:rPr>
+                <w:b/>
+                <w:sz w:val="16"/>
+              </w:rPr>
+              <w:t>Prazo de comunicação das alterações</w:t>
+            </w:r>
+          </w:p>
+        </w:tc>
+        <w:tc>
+          <w:tcPr>
+            <w:tcW w:type="dxa" w:w="3023"/>
+          </w:tcPr>
+          <w:p>
+            <w:r>
+              <w:rPr>
+                <w:b w:val="0"/>
+                <w:sz w:val="16"/>
+              </w:rPr>
+              <w:t>15 dias após a ocorrência</w:t>
+              <w:br/>
+              <w:t>(Art.º 63.º, n.º 1)</w:t>
+            </w:r>
+          </w:p>
+        </w:tc>
+        <w:tc>
+          <w:tcPr>
+            <w:tcW w:type="dxa" w:w="3024"/>
+          </w:tcPr>
+          <w:p>
+            <w:r>
+              <w:rPr>
+                <w:b w:val="0"/>
+                <w:sz w:val="16"/>
+              </w:rPr>
+              <w:t>15 dias após a ocorrência</w:t>
+              <w:br/>
+              <w:t>(Art.º 38.º, n.º 1)</w:t>
+            </w:r>
+          </w:p>
+        </w:tc>
+        <w:tc>
+          <w:tcPr>
+            <w:tcW w:type="dxa" w:w="3024"/>
+          </w:tcPr>
+          <w:p>
+            <w:r>
+              <w:rPr>
+                <w:b w:val="0"/>
+                <w:sz w:val="16"/>
+              </w:rPr>
+              <w:t>15 dias após a ocorrência</w:t>
+              <w:br/>
+              <w:t>(Art.º 3.º-F, n.º 1)</w:t>
+            </w:r>
+          </w:p>
+        </w:tc>
+      </w:tr>
+      <w:tr>
+        <w:tc>
+          <w:tcPr>
+            <w:tcW w:type="dxa" w:w="2268"/>
+          </w:tcPr>
+          <w:p>
+            <w:r>
+              <w:rPr>
+                <w:b/>
+                <w:sz w:val="16"/>
+              </w:rPr>
+              <w:t>Via de comunicação das alterações</w:t>
+            </w:r>
+          </w:p>
+        </w:tc>
+        <w:tc>
+          <w:tcPr>
+            <w:tcW w:type="dxa" w:w="3023"/>
+          </w:tcPr>
+          <w:p>
+            <w:r>
+              <w:rPr>
+                <w:b w:val="0"/>
+                <w:sz w:val="16"/>
+              </w:rPr>
+              <w:t>✅ Via eletrónica — balcão único eletrónico</w:t>
+              <w:br/>
+              <w:t>(Art.º 63.º, n.º 1)</w:t>
+            </w:r>
+          </w:p>
+        </w:tc>
+        <w:tc>
+          <w:tcPr>
+            <w:tcW w:type="dxa" w:w="3024"/>
+          </w:tcPr>
+          <w:p>
+            <w:r>
+              <w:rPr>
+                <w:b w:val="0"/>
+                <w:sz w:val="16"/>
+              </w:rPr>
+              <w:t>❌ Comunicação à DGAV — sem referência expressa a via eletrónica</w:t>
+              <w:br/>
+              <w:t>(Art.º 38.º, n.º 1)</w:t>
+            </w:r>
+          </w:p>
+        </w:tc>
+        <w:tc>
+          <w:tcPr>
+            <w:tcW w:type="dxa" w:w="3024"/>
+          </w:tcPr>
+          <w:p>
+            <w:r>
+              <w:rPr>
+                <w:b w:val="0"/>
+                <w:sz w:val="16"/>
+              </w:rPr>
+              <w:t>✅ Via eletrónica — balcão único eletrónico</w:t>
+              <w:br/>
+              <w:t>(Art.º 3.º-F, n.º 1)</w:t>
+            </w:r>
+          </w:p>
+        </w:tc>
+      </w:tr>
+      <w:tr>
+        <w:tc>
+          <w:tcPr>
+            <w:tcW w:type="dxa" w:w="2268"/>
+          </w:tcPr>
+          <w:p>
+            <w:r>
+              <w:rPr>
+                <w:b/>
+                <w:sz w:val="16"/>
+              </w:rPr>
+              <w:t>Entidade responsável pela atualização do registo</w:t>
+            </w:r>
+          </w:p>
+        </w:tc>
+        <w:tc>
+          <w:tcPr>
+            <w:tcW w:type="dxa" w:w="3023"/>
+          </w:tcPr>
+          <w:p>
+            <w:r>
+              <w:rPr>
+                <w:b w:val="0"/>
+                <w:sz w:val="16"/>
+              </w:rPr>
+              <w:t>"Compete à DGAV ICNF, I.P., atualizar" — referência a dois organismos (possível erro de redação)</w:t>
+              <w:br/>
+              <w:t>(Art.º 63.º, n.º 3)</w:t>
+            </w:r>
+          </w:p>
+        </w:tc>
+        <w:tc>
+          <w:tcPr>
+            <w:tcW w:type="dxa" w:w="3024"/>
+          </w:tcPr>
+          <w:p>
+            <w:r>
+              <w:rPr>
+                <w:b w:val="0"/>
+                <w:sz w:val="16"/>
+              </w:rPr>
+              <w:t>"Compete à DGAV atualizar"</w:t>
+              <w:br/>
+              <w:t>(Art.º 38.º, n.º 3)</w:t>
+            </w:r>
+          </w:p>
+        </w:tc>
+        <w:tc>
+          <w:tcPr>
+            <w:tcW w:type="dxa" w:w="3024"/>
+          </w:tcPr>
+          <w:p>
+            <w:r>
+              <w:rPr>
+                <w:b w:val="0"/>
+                <w:sz w:val="16"/>
+              </w:rPr>
+              <w:t>"Compete à DGAV atualizar"</w:t>
+              <w:br/>
+              <w:t>(Art.º 3.º-F, n.º 3)</w:t>
+            </w:r>
+          </w:p>
+        </w:tc>
+      </w:tr>
+    </w:tbl>
+    <w:p>
+      <w:pPr>
+        <w:spacing w:before="0" w:after="0"/>
+      </w:pPr>
+    </w:p>
+    <w:p>
+      <w:r>
+        <w:rPr>
+          <w:b/>
+          <w:sz w:val="20"/>
+        </w:rPr>
+        <w:t>6. Suspensão de atividade e encerramento</w:t>
+      </w:r>
+    </w:p>
+    <w:tbl>
+      <w:tblPr>
+        <w:tblStyle w:val="TableGrid"/>
+        <w:tblW w:type="auto" w:w="0"/>
+        <w:tblLook w:firstColumn="1" w:firstRow="1" w:lastColumn="0" w:lastRow="0" w:noHBand="0" w:noVBand="1" w:val="04A0"/>
+      </w:tblPr>
+      <w:tblGrid>
+        <w:gridCol w:w="2491"/>
+        <w:gridCol w:w="2491"/>
+        <w:gridCol w:w="2491"/>
+        <w:gridCol w:w="2491"/>
+      </w:tblGrid>
+      <w:tr>
+        <w:tc>
+          <w:tcPr>
+            <w:tcW w:type="dxa" w:w="2268"/>
+          </w:tcPr>
+          <w:p>
+            <w:r>
+              <w:rPr>
+                <w:b/>
+                <w:sz w:val="17"/>
+              </w:rPr>
+              <w:t>Critério</w:t>
+            </w:r>
+          </w:p>
+        </w:tc>
+        <w:tc>
+          <w:tcPr>
+            <w:tcW w:type="dxa" w:w="3023"/>
+          </w:tcPr>
+          <w:p>
+            <w:r>
+              <w:rPr>
+                <w:b/>
+                <w:sz w:val="17"/>
+              </w:rPr>
+              <w:t>@rgbeac</w:t>
+              <w:br/>
+              <w:t>(proposta jun. 2025)</w:t>
+            </w:r>
+          </w:p>
+        </w:tc>
+        <w:tc>
+          <w:tcPr>
+            <w:tcW w:type="dxa" w:w="3024"/>
+          </w:tcPr>
+          <w:p>
+            <w:r>
+              <w:rPr>
+                <w:b/>
+                <w:sz w:val="17"/>
+              </w:rPr>
+              <w:t>@codigo</w:t>
+              <w:br/>
+              <w:t>(proposta DL n.º 214/2013)</w:t>
+            </w:r>
+          </w:p>
+        </w:tc>
+        <w:tc>
+          <w:tcPr>
+            <w:tcW w:type="dxa" w:w="3024"/>
+          </w:tcPr>
+          <w:p>
+            <w:r>
+              <w:rPr>
+                <w:b/>
+                <w:sz w:val="17"/>
+              </w:rPr>
+              <w:t>@legislacao</w:t>
+              <w:br/>
+              <w:t>(vigente)</w:t>
+            </w:r>
+          </w:p>
+        </w:tc>
+      </w:tr>
+      <w:tr>
+        <w:tc>
+          <w:tcPr>
+            <w:tcW w:type="dxa" w:w="2268"/>
+          </w:tcPr>
+          <w:p>
+            <w:r>
+              <w:rPr>
+                <w:b/>
+                <w:sz w:val="16"/>
+              </w:rPr>
+              <w:t>Órgão competente para determinar suspensão/encerramento</w:t>
+            </w:r>
+          </w:p>
+        </w:tc>
+        <w:tc>
+          <w:tcPr>
+            <w:tcW w:type="dxa" w:w="3023"/>
+          </w:tcPr>
+          <w:p>
+            <w:r>
+              <w:rPr>
+                <w:b w:val="0"/>
+                <w:sz w:val="16"/>
+              </w:rPr>
+              <w:t>"A DGAV" — sem identificar cargo</w:t>
               <w:br/>
               <w:t>(Art.º 64.º, n.º 1)</w:t>
             </w:r>
@@ -1689,7 +2334,7 @@
                 <w:b w:val="0"/>
                 <w:sz w:val="16"/>
               </w:rPr>
-              <w:t>a) Riscos higiossanitários; b) Maus-tratos; c) Graves problemas de saúde/bem-estar; d) Falta de condições de segurança</w:t>
+              <w:t>"O diretor-geral de Alimentação e Veterinária, mediante despacho"</w:t>
               <w:br/>
               <w:t>(Art.º 39.º, n.º 1)</w:t>
             </w:r>
@@ -1705,9 +2350,189 @@
                 <w:b w:val="0"/>
                 <w:sz w:val="16"/>
               </w:rPr>
-              <w:t>a) Riscos higiossanitários; b) Maus-tratos; c) Graves problemas de saúde/bem-estar; d) Falta de condições de segurança</w:t>
+              <w:t>"O diretor-geral de Alimentação e Veterinária, mediante despacho"</w:t>
               <w:br/>
               <w:t>(Art.º 3.º-G, n.º 1)</w:t>
+            </w:r>
+          </w:p>
+        </w:tc>
+      </w:tr>
+      <w:tr>
+        <w:tc>
+          <w:tcPr>
+            <w:tcW w:type="dxa" w:w="2268"/>
+          </w:tcPr>
+          <w:p>
+            <w:r>
+              <w:rPr>
+                <w:b/>
+                <w:sz w:val="16"/>
+              </w:rPr>
+              <w:t>Causas (a) Riscos higiossanitários</w:t>
+            </w:r>
+          </w:p>
+        </w:tc>
+        <w:tc>
+          <w:tcPr>
+            <w:tcW w:type="dxa" w:w="3023"/>
+          </w:tcPr>
+          <w:p>
+            <w:r>
+              <w:rPr>
+                <w:b w:val="0"/>
+                <w:sz w:val="16"/>
+              </w:rPr>
+              <w:t>✅ Al. a) — "que ponham em causa a saúde das pessoas **ou** dos animais"</w:t>
+            </w:r>
+          </w:p>
+        </w:tc>
+        <w:tc>
+          <w:tcPr>
+            <w:tcW w:type="dxa" w:w="3024"/>
+          </w:tcPr>
+          <w:p>
+            <w:r>
+              <w:rPr>
+                <w:b w:val="0"/>
+                <w:sz w:val="16"/>
+              </w:rPr>
+              <w:t>✅ Al. a) — "que ponham em causa a saúde das pessoas **e/ou** dos animais"</w:t>
+            </w:r>
+          </w:p>
+        </w:tc>
+        <w:tc>
+          <w:tcPr>
+            <w:tcW w:type="dxa" w:w="3024"/>
+          </w:tcPr>
+          <w:p>
+            <w:r>
+              <w:rPr>
+                <w:b w:val="0"/>
+                <w:sz w:val="16"/>
+              </w:rPr>
+              <w:t>✅ Al. a) — "que ponham em causa a saúde das pessoas **e ou** dos animais"</w:t>
+            </w:r>
+          </w:p>
+        </w:tc>
+      </w:tr>
+      <w:tr>
+        <w:tc>
+          <w:tcPr>
+            <w:tcW w:type="dxa" w:w="2268"/>
+          </w:tcPr>
+          <w:p>
+            <w:r>
+              <w:rPr>
+                <w:b/>
+                <w:sz w:val="16"/>
+              </w:rPr>
+              <w:t>Causas (b) (c) (d) — maus-tratos, saúde/bem-estar, segurança</w:t>
+            </w:r>
+          </w:p>
+        </w:tc>
+        <w:tc>
+          <w:tcPr>
+            <w:tcW w:type="dxa" w:w="3023"/>
+          </w:tcPr>
+          <w:p>
+            <w:r>
+              <w:rPr>
+                <w:b w:val="0"/>
+                <w:sz w:val="16"/>
+              </w:rPr>
+              <w:t>✅ Als. b), c), d) — idêntico ao @codigo e @legislacao</w:t>
+            </w:r>
+          </w:p>
+        </w:tc>
+        <w:tc>
+          <w:tcPr>
+            <w:tcW w:type="dxa" w:w="3024"/>
+          </w:tcPr>
+          <w:p>
+            <w:r>
+              <w:rPr>
+                <w:b w:val="0"/>
+                <w:sz w:val="16"/>
+              </w:rPr>
+              <w:t>✅ Als. b), c), d)</w:t>
+            </w:r>
+          </w:p>
+        </w:tc>
+        <w:tc>
+          <w:tcPr>
+            <w:tcW w:type="dxa" w:w="3024"/>
+          </w:tcPr>
+          <w:p>
+            <w:r>
+              <w:rPr>
+                <w:b w:val="0"/>
+                <w:sz w:val="16"/>
+              </w:rPr>
+              <w:t>✅ Als. b), c), d)</w:t>
+            </w:r>
+          </w:p>
+        </w:tc>
+      </w:tr>
+      <w:tr>
+        <w:tc>
+          <w:tcPr>
+            <w:tcW w:type="dxa" w:w="2268"/>
+          </w:tcPr>
+          <w:p>
+            <w:r>
+              <w:rPr>
+                <w:b/>
+                <w:sz w:val="16"/>
+              </w:rPr>
+              <w:t>Instrução do processo</w:t>
+            </w:r>
+          </w:p>
+        </w:tc>
+        <w:tc>
+          <w:tcPr>
+            <w:tcW w:type="dxa" w:w="3023"/>
+          </w:tcPr>
+          <w:p>
+            <w:r>
+              <w:rPr>
+                <w:b w:val="0"/>
+                <w:sz w:val="16"/>
+              </w:rPr>
+              <w:t>"Processo instruído pela DGAV" — nível central</w:t>
+              <w:br/>
+              <w:t>(Art.º 64.º, n.º 2)</w:t>
+            </w:r>
+          </w:p>
+        </w:tc>
+        <w:tc>
+          <w:tcPr>
+            <w:tcW w:type="dxa" w:w="3024"/>
+          </w:tcPr>
+          <w:p>
+            <w:r>
+              <w:rPr>
+                <w:b w:val="0"/>
+                <w:sz w:val="16"/>
+              </w:rPr>
+              <w:t>"Processo instruído pela direção de serviços de alimentação e veterinária da região" — nível regional</w:t>
+              <w:br/>
+              <w:t>(Art.º 39.º, n.º 2)</w:t>
+            </w:r>
+          </w:p>
+        </w:tc>
+        <w:tc>
+          <w:tcPr>
+            <w:tcW w:type="dxa" w:w="3024"/>
+          </w:tcPr>
+          <w:p>
+            <w:r>
+              <w:rPr>
+                <w:b w:val="0"/>
+                <w:sz w:val="16"/>
+              </w:rPr>
+              <w:t>"Processo instruído pela direção de serviços veterinários da região" — nível regional</w:t>
+              <w:br/>
+              <w:t>(Art.º 3.º-G, n.º 2)</w:t>
             </w:r>
           </w:p>
         </w:tc>
@@ -1787,7 +2612,7 @@
                 <w:b/>
                 <w:sz w:val="16"/>
               </w:rPr>
-              <w:t>Prazo para cessar atividade após decisão de encerramento</w:t>
+              <w:t>Prazo para cessar após decisão de encerramento definitivo</w:t>
             </w:r>
           </w:p>
         </w:tc>
@@ -1801,7 +2626,7 @@
                 <w:b w:val="0"/>
                 <w:sz w:val="16"/>
               </w:rPr>
-              <w:t>10 dias úteis</w:t>
+              <w:t>⚠️ 10 dias úteis</w:t>
               <w:br/>
               <w:t>(Art.º 64.º, n.º 5)</w:t>
             </w:r>
@@ -1851,7 +2676,7 @@
                 <w:b/>
                 <w:sz w:val="16"/>
               </w:rPr>
-              <w:t>Reabertura após suspensão</w:t>
+              <w:t>Responsável pela recolha dos animais em caso de encerramento compulsivo</w:t>
             </w:r>
           </w:p>
         </w:tc>
@@ -1865,9 +2690,9 @@
                 <w:b w:val="0"/>
                 <w:sz w:val="16"/>
               </w:rPr>
-              <w:t>Visita de controlo pela DGAV no prazo de 20 dias; decisão de permissão de reabertura pelo diretor-geral</w:t>
+              <w:t>"Câmaras municipais executam as medidas; **centros de bem-estar animal** procedem à recolha"</w:t>
               <w:br/>
-              <w:t>(Art.º 65.º)</w:t>
+              <w:t>(Art.º 64.º, n.º 6)</w:t>
             </w:r>
           </w:p>
         </w:tc>
@@ -1881,9 +2706,9 @@
                 <w:b w:val="0"/>
                 <w:sz w:val="16"/>
               </w:rPr>
-              <w:t>Visita de controlo no prazo de 20 dias; decisão de permissão de reabertura pelo DG da Alimentação e Veterinária</w:t>
+              <w:t>"Câmaras municipais executam as medidas e procedem, quando necessário, à recolha dos animais"</w:t>
               <w:br/>
-              <w:t>(Art.º 40.º)</w:t>
+              <w:t>(Art.º 39.º, n.º 6)</w:t>
             </w:r>
           </w:p>
         </w:tc>
@@ -1897,9 +2722,100 @@
                 <w:b w:val="0"/>
                 <w:sz w:val="16"/>
               </w:rPr>
-              <w:t>Visita de controlo no prazo de 20 dias; decisão de permissão de reabertura pelo DG da Alimentação e Veterinária</w:t>
+              <w:t>"Câmaras municipais executam as medidas e procedem, quando necessário, à recolha dos animais"</w:t>
               <w:br/>
-              <w:t>(Art.º 3.º-H)</w:t>
+              <w:t>(Art.º 3.º-G, n.º 6)</w:t>
+            </w:r>
+          </w:p>
+        </w:tc>
+      </w:tr>
+    </w:tbl>
+    <w:p>
+      <w:pPr>
+        <w:spacing w:before="0" w:after="0"/>
+      </w:pPr>
+    </w:p>
+    <w:p>
+      <w:r>
+        <w:rPr>
+          <w:b/>
+          <w:sz w:val="20"/>
+        </w:rPr>
+        <w:t>7. Permissão de reabertura após suspensão</w:t>
+      </w:r>
+    </w:p>
+    <w:tbl>
+      <w:tblPr>
+        <w:tblStyle w:val="TableGrid"/>
+        <w:tblW w:type="auto" w:w="0"/>
+        <w:tblLook w:firstColumn="1" w:firstRow="1" w:lastColumn="0" w:lastRow="0" w:noHBand="0" w:noVBand="1" w:val="04A0"/>
+      </w:tblPr>
+      <w:tblGrid>
+        <w:gridCol w:w="2491"/>
+        <w:gridCol w:w="2491"/>
+        <w:gridCol w:w="2491"/>
+        <w:gridCol w:w="2491"/>
+      </w:tblGrid>
+      <w:tr>
+        <w:tc>
+          <w:tcPr>
+            <w:tcW w:type="dxa" w:w="2268"/>
+          </w:tcPr>
+          <w:p>
+            <w:r>
+              <w:rPr>
+                <w:b/>
+                <w:sz w:val="17"/>
+              </w:rPr>
+              <w:t>Critério</w:t>
+            </w:r>
+          </w:p>
+        </w:tc>
+        <w:tc>
+          <w:tcPr>
+            <w:tcW w:type="dxa" w:w="3023"/>
+          </w:tcPr>
+          <w:p>
+            <w:r>
+              <w:rPr>
+                <w:b/>
+                <w:sz w:val="17"/>
+              </w:rPr>
+              <w:t>@rgbeac</w:t>
+              <w:br/>
+              <w:t>(proposta jun. 2025)</w:t>
+            </w:r>
+          </w:p>
+        </w:tc>
+        <w:tc>
+          <w:tcPr>
+            <w:tcW w:type="dxa" w:w="3024"/>
+          </w:tcPr>
+          <w:p>
+            <w:r>
+              <w:rPr>
+                <w:b/>
+                <w:sz w:val="17"/>
+              </w:rPr>
+              <w:t>@codigo</w:t>
+              <w:br/>
+              <w:t>(proposta DL n.º 214/2013)</w:t>
+            </w:r>
+          </w:p>
+        </w:tc>
+        <w:tc>
+          <w:tcPr>
+            <w:tcW w:type="dxa" w:w="3024"/>
+          </w:tcPr>
+          <w:p>
+            <w:r>
+              <w:rPr>
+                <w:b/>
+                <w:sz w:val="17"/>
+              </w:rPr>
+              <w:t>@legislacao</w:t>
+              <w:br/>
+              <w:t>(vigente)</w:t>
             </w:r>
           </w:p>
         </w:tc>
@@ -1915,7 +2831,7 @@
                 <w:b/>
                 <w:sz w:val="16"/>
               </w:rPr>
-              <w:t>Reconhecimento mútuo (UE/EEE)</w:t>
+              <w:t>Órgão que realiza a visita de controlo</w:t>
             </w:r>
           </w:p>
         </w:tc>
@@ -1929,9 +2845,9 @@
                 <w:b w:val="0"/>
                 <w:sz w:val="16"/>
               </w:rPr>
-              <w:t>Previsto: sem duplicação de condições já verificadas noutro Estado-Membro</w:t>
+              <w:t>"A DGAV realiza visita de controlo"</w:t>
               <w:br/>
-              <w:t>(Art.º 67.º)</w:t>
+              <w:t>(Art.º 65.º, n.º 1)</w:t>
             </w:r>
           </w:p>
         </w:tc>
@@ -1945,9 +2861,9 @@
                 <w:b w:val="0"/>
                 <w:sz w:val="16"/>
               </w:rPr>
-              <w:t>Previsto: sem duplicação de condições já verificadas noutro Estado-Membro</w:t>
+              <w:t>"A direção de serviços veterinários de alimentação e veterinária da região" realiza a visita</w:t>
               <w:br/>
-              <w:t>(Art.º 42.º)</w:t>
+              <w:t>(Art.º 40.º, n.º 1)</w:t>
             </w:r>
           </w:p>
         </w:tc>
@@ -1961,7 +2877,470 @@
                 <w:b w:val="0"/>
                 <w:sz w:val="16"/>
               </w:rPr>
-              <w:t>Não previsto expressamente</w:t>
+              <w:t>"A direção de serviços veterinários da região" realiza a visita</w:t>
+              <w:br/>
+              <w:t>(Art.º 3.º-H, n.º 1)</w:t>
+            </w:r>
+          </w:p>
+        </w:tc>
+      </w:tr>
+      <w:tr>
+        <w:tc>
+          <w:tcPr>
+            <w:tcW w:type="dxa" w:w="2268"/>
+          </w:tcPr>
+          <w:p>
+            <w:r>
+              <w:rPr>
+                <w:b/>
+                <w:sz w:val="16"/>
+              </w:rPr>
+              <w:t>Prazo para realização da visita de controlo</w:t>
+            </w:r>
+          </w:p>
+        </w:tc>
+        <w:tc>
+          <w:tcPr>
+            <w:tcW w:type="dxa" w:w="3023"/>
+          </w:tcPr>
+          <w:p>
+            <w:r>
+              <w:rPr>
+                <w:b w:val="0"/>
+                <w:sz w:val="16"/>
+              </w:rPr>
+              <w:t>20 dias</w:t>
+              <w:br/>
+              <w:t>(Art.º 65.º, n.º 1)</w:t>
+            </w:r>
+          </w:p>
+        </w:tc>
+        <w:tc>
+          <w:tcPr>
+            <w:tcW w:type="dxa" w:w="3024"/>
+          </w:tcPr>
+          <w:p>
+            <w:r>
+              <w:rPr>
+                <w:b w:val="0"/>
+                <w:sz w:val="16"/>
+              </w:rPr>
+              <w:t>20 dias</w:t>
+              <w:br/>
+              <w:t>(Art.º 40.º, n.º 1)</w:t>
+            </w:r>
+          </w:p>
+        </w:tc>
+        <w:tc>
+          <w:tcPr>
+            <w:tcW w:type="dxa" w:w="3024"/>
+          </w:tcPr>
+          <w:p>
+            <w:r>
+              <w:rPr>
+                <w:b w:val="0"/>
+                <w:sz w:val="16"/>
+              </w:rPr>
+              <w:t>20 dias</w:t>
+              <w:br/>
+              <w:t>(Art.º 3.º-H, n.º 1)</w:t>
+            </w:r>
+          </w:p>
+        </w:tc>
+      </w:tr>
+      <w:tr>
+        <w:tc>
+          <w:tcPr>
+            <w:tcW w:type="dxa" w:w="2268"/>
+          </w:tcPr>
+          <w:p>
+            <w:r>
+              <w:rPr>
+                <w:b/>
+                <w:sz w:val="16"/>
+              </w:rPr>
+              <w:t>Prazo para decisão de reabertura (silêncio → sem deferimento tácito)</w:t>
+            </w:r>
+          </w:p>
+        </w:tc>
+        <w:tc>
+          <w:tcPr>
+            <w:tcW w:type="dxa" w:w="3023"/>
+          </w:tcPr>
+          <w:p>
+            <w:r>
+              <w:rPr>
+                <w:b w:val="0"/>
+                <w:sz w:val="16"/>
+              </w:rPr>
+              <w:t>30 dias (ou 10 dias após visita)</w:t>
+              <w:br/>
+              <w:t>(Art.º 65.º, n.º 2)</w:t>
+            </w:r>
+          </w:p>
+        </w:tc>
+        <w:tc>
+          <w:tcPr>
+            <w:tcW w:type="dxa" w:w="3024"/>
+          </w:tcPr>
+          <w:p>
+            <w:r>
+              <w:rPr>
+                <w:b w:val="0"/>
+                <w:sz w:val="16"/>
+              </w:rPr>
+              <w:t>30 dias (ou 10 dias após visita)</w:t>
+              <w:br/>
+              <w:t>(Art.º 40.º, n.º 2)</w:t>
+            </w:r>
+          </w:p>
+        </w:tc>
+        <w:tc>
+          <w:tcPr>
+            <w:tcW w:type="dxa" w:w="3024"/>
+          </w:tcPr>
+          <w:p>
+            <w:r>
+              <w:rPr>
+                <w:b w:val="0"/>
+                <w:sz w:val="16"/>
+              </w:rPr>
+              <w:t>30 dias (ou 10 dias após visita)</w:t>
+              <w:br/>
+              <w:t>(Art.º 3.º-H, n.º 2)</w:t>
+            </w:r>
+          </w:p>
+        </w:tc>
+      </w:tr>
+      <w:tr>
+        <w:tc>
+          <w:tcPr>
+            <w:tcW w:type="dxa" w:w="2268"/>
+          </w:tcPr>
+          <w:p>
+            <w:r>
+              <w:rPr>
+                <w:b/>
+                <w:sz w:val="16"/>
+              </w:rPr>
+              <w:t>Publicitação da reabertura</w:t>
+            </w:r>
+          </w:p>
+        </w:tc>
+        <w:tc>
+          <w:tcPr>
+            <w:tcW w:type="dxa" w:w="3023"/>
+          </w:tcPr>
+          <w:p>
+            <w:r>
+              <w:rPr>
+                <w:b w:val="0"/>
+                <w:sz w:val="16"/>
+              </w:rPr>
+              <w:t>✅ Pelos mesmos meios usados para publicitar a suspensão</w:t>
+              <w:br/>
+              <w:t>(Art.º 65.º, n.º 3)</w:t>
+            </w:r>
+          </w:p>
+        </w:tc>
+        <w:tc>
+          <w:tcPr>
+            <w:tcW w:type="dxa" w:w="3024"/>
+          </w:tcPr>
+          <w:p>
+            <w:r>
+              <w:rPr>
+                <w:b w:val="0"/>
+                <w:sz w:val="16"/>
+              </w:rPr>
+              <w:t>✅ Pelos mesmos meios</w:t>
+              <w:br/>
+              <w:t>(Art.º 40.º, n.º 3)</w:t>
+            </w:r>
+          </w:p>
+        </w:tc>
+        <w:tc>
+          <w:tcPr>
+            <w:tcW w:type="dxa" w:w="3024"/>
+          </w:tcPr>
+          <w:p>
+            <w:r>
+              <w:rPr>
+                <w:b w:val="0"/>
+                <w:sz w:val="16"/>
+              </w:rPr>
+              <w:t>✅ Pelos mesmos meios</w:t>
+              <w:br/>
+              <w:t>(Art.º 3.º-H, n.º 3)</w:t>
+            </w:r>
+          </w:p>
+        </w:tc>
+      </w:tr>
+    </w:tbl>
+    <w:p>
+      <w:pPr>
+        <w:spacing w:before="0" w:after="0"/>
+      </w:pPr>
+    </w:p>
+    <w:p>
+      <w:r>
+        <w:rPr>
+          <w:b/>
+          <w:sz w:val="20"/>
+        </w:rPr>
+        <w:t>8. Reconhecimento mútuo (UE/EEE)</w:t>
+      </w:r>
+    </w:p>
+    <w:tbl>
+      <w:tblPr>
+        <w:tblStyle w:val="TableGrid"/>
+        <w:tblW w:type="auto" w:w="0"/>
+        <w:tblLook w:firstColumn="1" w:firstRow="1" w:lastColumn="0" w:lastRow="0" w:noHBand="0" w:noVBand="1" w:val="04A0"/>
+      </w:tblPr>
+      <w:tblGrid>
+        <w:gridCol w:w="2491"/>
+        <w:gridCol w:w="2491"/>
+        <w:gridCol w:w="2491"/>
+        <w:gridCol w:w="2491"/>
+      </w:tblGrid>
+      <w:tr>
+        <w:tc>
+          <w:tcPr>
+            <w:tcW w:type="dxa" w:w="2268"/>
+          </w:tcPr>
+          <w:p>
+            <w:r>
+              <w:rPr>
+                <w:b/>
+                <w:sz w:val="17"/>
+              </w:rPr>
+              <w:t>Critério</w:t>
+            </w:r>
+          </w:p>
+        </w:tc>
+        <w:tc>
+          <w:tcPr>
+            <w:tcW w:type="dxa" w:w="3023"/>
+          </w:tcPr>
+          <w:p>
+            <w:r>
+              <w:rPr>
+                <w:b/>
+                <w:sz w:val="17"/>
+              </w:rPr>
+              <w:t>@rgbeac</w:t>
+              <w:br/>
+              <w:t>(proposta jun. 2025)</w:t>
+            </w:r>
+          </w:p>
+        </w:tc>
+        <w:tc>
+          <w:tcPr>
+            <w:tcW w:type="dxa" w:w="3024"/>
+          </w:tcPr>
+          <w:p>
+            <w:r>
+              <w:rPr>
+                <w:b/>
+                <w:sz w:val="17"/>
+              </w:rPr>
+              <w:t>@codigo</w:t>
+              <w:br/>
+              <w:t>(proposta DL n.º 214/2013)</w:t>
+            </w:r>
+          </w:p>
+        </w:tc>
+        <w:tc>
+          <w:tcPr>
+            <w:tcW w:type="dxa" w:w="3024"/>
+          </w:tcPr>
+          <w:p>
+            <w:r>
+              <w:rPr>
+                <w:b/>
+                <w:sz w:val="17"/>
+              </w:rPr>
+              <w:t>@legislacao</w:t>
+              <w:br/>
+              <w:t>(vigente)</w:t>
+            </w:r>
+          </w:p>
+        </w:tc>
+      </w:tr>
+      <w:tr>
+        <w:tc>
+          <w:tcPr>
+            <w:tcW w:type="dxa" w:w="2268"/>
+          </w:tcPr>
+          <w:p>
+            <w:r>
+              <w:rPr>
+                <w:b/>
+                <w:sz w:val="16"/>
+              </w:rPr>
+              <w:t>Proibição de duplicação de condições (n.º 1)</w:t>
+            </w:r>
+          </w:p>
+        </w:tc>
+        <w:tc>
+          <w:tcPr>
+            <w:tcW w:type="dxa" w:w="3023"/>
+          </w:tcPr>
+          <w:p>
+            <w:r>
+              <w:rPr>
+                <w:b w:val="0"/>
+                <w:sz w:val="16"/>
+              </w:rPr>
+              <w:t>✅ Art.º 67.º, n.º 1</w:t>
+            </w:r>
+          </w:p>
+        </w:tc>
+        <w:tc>
+          <w:tcPr>
+            <w:tcW w:type="dxa" w:w="3024"/>
+          </w:tcPr>
+          <w:p>
+            <w:r>
+              <w:rPr>
+                <w:b w:val="0"/>
+                <w:sz w:val="16"/>
+              </w:rPr>
+              <w:t>✅ Art.º 42.º, n.º 1</w:t>
+            </w:r>
+          </w:p>
+        </w:tc>
+        <w:tc>
+          <w:tcPr>
+            <w:tcW w:type="dxa" w:w="3024"/>
+          </w:tcPr>
+          <w:p>
+            <w:r>
+              <w:rPr>
+                <w:b w:val="0"/>
+                <w:sz w:val="16"/>
+              </w:rPr>
+              <w:t>❌ Ausente — não previsto em artigo equivalente.</w:t>
+            </w:r>
+          </w:p>
+        </w:tc>
+      </w:tr>
+      <w:tr>
+        <w:tc>
+          <w:tcPr>
+            <w:tcW w:type="dxa" w:w="2268"/>
+          </w:tcPr>
+          <w:p>
+            <w:r>
+              <w:rPr>
+                <w:b/>
+                <w:sz w:val="16"/>
+              </w:rPr>
+              <w:t>Exceção para instalações físicas em território nacional (n.º 2)</w:t>
+            </w:r>
+          </w:p>
+        </w:tc>
+        <w:tc>
+          <w:tcPr>
+            <w:tcW w:type="dxa" w:w="3023"/>
+          </w:tcPr>
+          <w:p>
+            <w:r>
+              <w:rPr>
+                <w:b w:val="0"/>
+                <w:sz w:val="16"/>
+              </w:rPr>
+              <w:t>✅ Art.º 67.º, n.º 2</w:t>
+            </w:r>
+          </w:p>
+        </w:tc>
+        <w:tc>
+          <w:tcPr>
+            <w:tcW w:type="dxa" w:w="3024"/>
+          </w:tcPr>
+          <w:p>
+            <w:r>
+              <w:rPr>
+                <w:b w:val="0"/>
+                <w:sz w:val="16"/>
+              </w:rPr>
+              <w:t>✅ Art.º 42.º, n.º 2</w:t>
+            </w:r>
+          </w:p>
+        </w:tc>
+        <w:tc>
+          <w:tcPr>
+            <w:tcW w:type="dxa" w:w="3024"/>
+          </w:tcPr>
+          <w:p>
+            <w:r>
+              <w:rPr>
+                <w:b w:val="0"/>
+                <w:sz w:val="16"/>
+              </w:rPr>
+              <w:t>❌ Ausente</w:t>
+            </w:r>
+          </w:p>
+        </w:tc>
+      </w:tr>
+      <w:tr>
+        <w:tc>
+          <w:tcPr>
+            <w:tcW w:type="dxa" w:w="2268"/>
+          </w:tcPr>
+          <w:p>
+            <w:r>
+              <w:rPr>
+                <w:b/>
+                <w:sz w:val="16"/>
+              </w:rPr>
+              <w:t>Ressalva de qualificações profissionais (n.º 3)</w:t>
+            </w:r>
+          </w:p>
+        </w:tc>
+        <w:tc>
+          <w:tcPr>
+            <w:tcW w:type="dxa" w:w="3023"/>
+          </w:tcPr>
+          <w:p>
+            <w:r>
+              <w:rPr>
+                <w:b w:val="0"/>
+                <w:sz w:val="16"/>
+              </w:rPr>
+              <w:t>✅ "A legislação aplicável ao reconhecimento mútuo de requisitos relativos a qualificações"</w:t>
+              <w:br/>
+              <w:t>(Art.º 67.º, n.º 3)</w:t>
+            </w:r>
+          </w:p>
+        </w:tc>
+        <w:tc>
+          <w:tcPr>
+            <w:tcW w:type="dxa" w:w="3024"/>
+          </w:tcPr>
+          <w:p>
+            <w:r>
+              <w:rPr>
+                <w:b w:val="0"/>
+                <w:sz w:val="16"/>
+              </w:rPr>
+              <w:t>✅ Remissão expressa para a Lei n.º 9/2009 (qualificações)</w:t>
+              <w:br/>
+              <w:t>(Art.º 42.º, n.º 3 — texto do docx)</w:t>
+            </w:r>
+          </w:p>
+        </w:tc>
+        <w:tc>
+          <w:tcPr>
+            <w:tcW w:type="dxa" w:w="3024"/>
+          </w:tcPr>
+          <w:p>
+            <w:r>
+              <w:rPr>
+                <w:b w:val="0"/>
+                <w:sz w:val="16"/>
+              </w:rPr>
+              <w:t>❌ Ausente</w:t>
             </w:r>
           </w:p>
         </w:tc>

</xml_diff>